<commit_message>
caed motion-brief docx: Times New Roman (the typst face) via docx/reference.xml (docxref: header parts); right margin 1 in as typst (DEF-FORM-002), line numbers ending 1 in from the edge as typst so the content gate drops them (DEF-CONT-001), tables and tabs to the 6 in text width; check.sh --engine docx 8 passed 0 failed (fb-595.63)
</commit_message>
<xml_diff>
--- a/courts/ninth-circuit/california/federal/eastern-district/motion-brief/usage/OUTPUT-motion-brief.docx
+++ b/courts/ninth-circuit/california/federal/eastern-district/motion-brief/usage/OUTPUT-motion-brief.docx
@@ -173,7 +173,7 @@
     </w:p>
     <w:tbl>
       <w:tblPr>
-        <w:tblW w:w="9000" w:type="dxa"/>
+        <w:tblW w:w="8640" w:type="dxa"/>
         <w:tblBorders>
           <w:top w:val="nil"/>
           <w:left w:val="nil"/>
@@ -192,7 +192,7 @@
       <w:tblGrid>
         <w:gridCol w:w="4608"/>
         <w:gridCol w:w="288"/>
-        <w:gridCol w:w="4104"/>
+        <w:gridCol w:w="3744"/>
       </w:tblGrid>
       <w:tr>
         <w:tc>
@@ -260,7 +260,7 @@
         </w:tc>
         <w:tc>
           <w:tcPr>
-            <w:tcW w:w="4104" w:type="dxa"/>
+            <w:tcW w:w="3744" w:type="dxa"/>
           </w:tcPr>
           <w:p>
             <w:pPr>
@@ -407,7 +407,7 @@
     </w:p>
     <w:tbl>
       <w:tblPr>
-        <w:tblW w:w="9000" w:type="dxa"/>
+        <w:tblW w:w="8640" w:type="dxa"/>
         <w:tblBorders>
           <w:top w:val="nil"/>
           <w:left w:val="nil"/>
@@ -426,7 +426,7 @@
       <w:tblGrid>
         <w:gridCol w:w="3744"/>
         <w:gridCol w:w="288"/>
-        <w:gridCol w:w="4968"/>
+        <w:gridCol w:w="4608"/>
       </w:tblGrid>
       <w:tr>
         <w:trPr>
@@ -457,7 +457,7 @@
         </w:tc>
         <w:tc>
           <w:tcPr>
-            <w:tcW w:w="4968" w:type="dxa"/>
+            <w:tcW w:w="4608" w:type="dxa"/>
           </w:tcPr>
           <w:p>
             <w:pPr>
@@ -520,7 +520,7 @@
           <w:footerReference w:type="default" r:id="rId100"/>
           <w:type w:val="nextPage"/>
           <w:pgSz w:w="12240" w:h="15840"/>
-          <w:pgMar w:top="1440" w:right="1080" w:bottom="960" w:left="2160" w:header="720" w:footer="600" w:gutter="0"/>
+          <w:pgMar w:top="1440" w:right="1440" w:bottom="960" w:left="2160" w:header="720" w:footer="600" w:gutter="0"/>
           <w:pgBorders w:offsetFrom="text">
             <w:left w:val="double" w:sz="4" w:space="12" w:color="000000"/>
             <w:right w:val="single" w:sz="4" w:space="7" w:color="000000"/>
@@ -598,7 +598,7 @@
         <w:tab/>
       </w:r>
       <w:r>
-        <w:t>1</w:t>
+        <w:t>2</w:t>
       </w:r>
     </w:p>
     <w:p>
@@ -612,7 +612,7 @@
         <w:tab/>
       </w:r>
       <w:r>
-        <w:t>1</w:t>
+        <w:t>2</w:t>
       </w:r>
     </w:p>
     <w:p>
@@ -1469,7 +1469,7 @@
           <w:footerReference w:type="default" r:id="rId100"/>
           <w:type w:val="nextPage"/>
           <w:pgSz w:w="12240" w:h="15840"/>
-          <w:pgMar w:top="1440" w:right="1080" w:bottom="960" w:left="2160" w:header="720" w:footer="600" w:gutter="0"/>
+          <w:pgMar w:top="1440" w:right="1440" w:bottom="960" w:left="2160" w:header="720" w:footer="600" w:gutter="0"/>
           <w:pgBorders w:offsetFrom="text">
             <w:left w:val="double" w:sz="4" w:space="12" w:color="000000"/>
             <w:right w:val="single" w:sz="4" w:space="7" w:color="000000"/>
@@ -1716,7 +1716,7 @@
     </w:p>
     <w:tbl>
       <w:tblPr>
-        <w:tblW w:w="9000" w:type="dxa"/>
+        <w:tblW w:w="8640" w:type="dxa"/>
         <w:tblBorders>
           <w:top w:val="nil"/>
           <w:left w:val="nil"/>
@@ -1735,7 +1735,7 @@
       <w:tblGrid>
         <w:gridCol w:w="3744"/>
         <w:gridCol w:w="288"/>
-        <w:gridCol w:w="4968"/>
+        <w:gridCol w:w="4608"/>
       </w:tblGrid>
       <w:tr>
         <w:trPr>
@@ -1766,7 +1766,7 @@
         </w:tc>
         <w:tc>
           <w:tcPr>
-            <w:tcW w:w="4968" w:type="dxa"/>
+            <w:tcW w:w="4608" w:type="dxa"/>
           </w:tcPr>
           <w:p>
             <w:pPr>
@@ -1824,7 +1824,7 @@
       <w:headerReference w:type="default" r:id="rId101"/>
       <w:footerReference w:type="default" r:id="rId100"/>
       <w:pgSz w:w="12240" w:h="15840"/>
-      <w:pgMar w:top="1440" w:right="1080" w:bottom="960" w:left="2160" w:header="720" w:footer="600" w:gutter="0"/>
+      <w:pgMar w:top="1440" w:right="1440" w:bottom="960" w:left="2160" w:header="720" w:footer="600" w:gutter="0"/>
       <w:pgBorders w:offsetFrom="text">
         <w:left w:val="double" w:sz="4" w:space="12" w:color="000000"/>
         <w:right w:val="single" w:sz="4" w:space="7" w:color="000000"/>
@@ -1897,7 +1897,7 @@
   <w:p>
     <w:pPr>
       <w:pStyle w:val="LineNo"/>
-      <w:framePr w:w="1555" w:hSpace="0" w:wrap="around" w:vAnchor="page" w:hAnchor="page" w:x="0" w:y="1440"/>
+      <w:framePr w:w="1440" w:hSpace="0" w:wrap="around" w:vAnchor="page" w:hAnchor="page" w:x="0" w:y="1440"/>
     </w:pPr>
     <w:r>
       <w:rPr>
@@ -1909,7 +1909,7 @@
   <w:p>
     <w:pPr>
       <w:pStyle w:val="LineNo"/>
-      <w:framePr w:w="1555" w:hSpace="0" w:wrap="around" w:vAnchor="page" w:hAnchor="page" w:x="0" w:y="1440"/>
+      <w:framePr w:w="1440" w:hSpace="0" w:wrap="around" w:vAnchor="page" w:hAnchor="page" w:x="0" w:y="1440"/>
     </w:pPr>
     <w:r>
       <w:rPr>
@@ -1921,7 +1921,7 @@
   <w:p>
     <w:pPr>
       <w:pStyle w:val="LineNo"/>
-      <w:framePr w:w="1555" w:hSpace="0" w:wrap="around" w:vAnchor="page" w:hAnchor="page" w:x="0" w:y="1440"/>
+      <w:framePr w:w="1440" w:hSpace="0" w:wrap="around" w:vAnchor="page" w:hAnchor="page" w:x="0" w:y="1440"/>
     </w:pPr>
     <w:r>
       <w:rPr>
@@ -1933,7 +1933,7 @@
   <w:p>
     <w:pPr>
       <w:pStyle w:val="LineNo"/>
-      <w:framePr w:w="1555" w:hSpace="0" w:wrap="around" w:vAnchor="page" w:hAnchor="page" w:x="0" w:y="1440"/>
+      <w:framePr w:w="1440" w:hSpace="0" w:wrap="around" w:vAnchor="page" w:hAnchor="page" w:x="0" w:y="1440"/>
     </w:pPr>
     <w:r>
       <w:rPr>
@@ -1945,7 +1945,7 @@
   <w:p>
     <w:pPr>
       <w:pStyle w:val="LineNo"/>
-      <w:framePr w:w="1555" w:hSpace="0" w:wrap="around" w:vAnchor="page" w:hAnchor="page" w:x="0" w:y="1440"/>
+      <w:framePr w:w="1440" w:hSpace="0" w:wrap="around" w:vAnchor="page" w:hAnchor="page" w:x="0" w:y="1440"/>
     </w:pPr>
     <w:r>
       <w:rPr>
@@ -1957,7 +1957,7 @@
   <w:p>
     <w:pPr>
       <w:pStyle w:val="LineNo"/>
-      <w:framePr w:w="1555" w:hSpace="0" w:wrap="around" w:vAnchor="page" w:hAnchor="page" w:x="0" w:y="1440"/>
+      <w:framePr w:w="1440" w:hSpace="0" w:wrap="around" w:vAnchor="page" w:hAnchor="page" w:x="0" w:y="1440"/>
     </w:pPr>
     <w:r>
       <w:rPr>
@@ -1969,7 +1969,7 @@
   <w:p>
     <w:pPr>
       <w:pStyle w:val="LineNo"/>
-      <w:framePr w:w="1555" w:hSpace="0" w:wrap="around" w:vAnchor="page" w:hAnchor="page" w:x="0" w:y="1440"/>
+      <w:framePr w:w="1440" w:hSpace="0" w:wrap="around" w:vAnchor="page" w:hAnchor="page" w:x="0" w:y="1440"/>
     </w:pPr>
     <w:r>
       <w:rPr>
@@ -1981,7 +1981,7 @@
   <w:p>
     <w:pPr>
       <w:pStyle w:val="LineNo"/>
-      <w:framePr w:w="1555" w:hSpace="0" w:wrap="around" w:vAnchor="page" w:hAnchor="page" w:x="0" w:y="1440"/>
+      <w:framePr w:w="1440" w:hSpace="0" w:wrap="around" w:vAnchor="page" w:hAnchor="page" w:x="0" w:y="1440"/>
     </w:pPr>
     <w:r>
       <w:rPr>
@@ -1993,7 +1993,7 @@
   <w:p>
     <w:pPr>
       <w:pStyle w:val="LineNo"/>
-      <w:framePr w:w="1555" w:hSpace="0" w:wrap="around" w:vAnchor="page" w:hAnchor="page" w:x="0" w:y="1440"/>
+      <w:framePr w:w="1440" w:hSpace="0" w:wrap="around" w:vAnchor="page" w:hAnchor="page" w:x="0" w:y="1440"/>
     </w:pPr>
     <w:r>
       <w:rPr>
@@ -2005,7 +2005,7 @@
   <w:p>
     <w:pPr>
       <w:pStyle w:val="LineNo"/>
-      <w:framePr w:w="1555" w:hSpace="0" w:wrap="around" w:vAnchor="page" w:hAnchor="page" w:x="0" w:y="1440"/>
+      <w:framePr w:w="1440" w:hSpace="0" w:wrap="around" w:vAnchor="page" w:hAnchor="page" w:x="0" w:y="1440"/>
     </w:pPr>
     <w:r>
       <w:rPr>
@@ -2017,7 +2017,7 @@
   <w:p>
     <w:pPr>
       <w:pStyle w:val="LineNo"/>
-      <w:framePr w:w="1555" w:hSpace="0" w:wrap="around" w:vAnchor="page" w:hAnchor="page" w:x="0" w:y="1440"/>
+      <w:framePr w:w="1440" w:hSpace="0" w:wrap="around" w:vAnchor="page" w:hAnchor="page" w:x="0" w:y="1440"/>
     </w:pPr>
     <w:r>
       <w:rPr>
@@ -2029,7 +2029,7 @@
   <w:p>
     <w:pPr>
       <w:pStyle w:val="LineNo"/>
-      <w:framePr w:w="1555" w:hSpace="0" w:wrap="around" w:vAnchor="page" w:hAnchor="page" w:x="0" w:y="1440"/>
+      <w:framePr w:w="1440" w:hSpace="0" w:wrap="around" w:vAnchor="page" w:hAnchor="page" w:x="0" w:y="1440"/>
     </w:pPr>
     <w:r>
       <w:rPr>
@@ -2041,7 +2041,7 @@
   <w:p>
     <w:pPr>
       <w:pStyle w:val="LineNo"/>
-      <w:framePr w:w="1555" w:hSpace="0" w:wrap="around" w:vAnchor="page" w:hAnchor="page" w:x="0" w:y="1440"/>
+      <w:framePr w:w="1440" w:hSpace="0" w:wrap="around" w:vAnchor="page" w:hAnchor="page" w:x="0" w:y="1440"/>
     </w:pPr>
     <w:r>
       <w:rPr>
@@ -2053,7 +2053,7 @@
   <w:p>
     <w:pPr>
       <w:pStyle w:val="LineNo"/>
-      <w:framePr w:w="1555" w:hSpace="0" w:wrap="around" w:vAnchor="page" w:hAnchor="page" w:x="0" w:y="1440"/>
+      <w:framePr w:w="1440" w:hSpace="0" w:wrap="around" w:vAnchor="page" w:hAnchor="page" w:x="0" w:y="1440"/>
     </w:pPr>
     <w:r>
       <w:rPr>
@@ -2065,7 +2065,7 @@
   <w:p>
     <w:pPr>
       <w:pStyle w:val="LineNo"/>
-      <w:framePr w:w="1555" w:hSpace="0" w:wrap="around" w:vAnchor="page" w:hAnchor="page" w:x="0" w:y="1440"/>
+      <w:framePr w:w="1440" w:hSpace="0" w:wrap="around" w:vAnchor="page" w:hAnchor="page" w:x="0" w:y="1440"/>
     </w:pPr>
     <w:r>
       <w:rPr>
@@ -2077,7 +2077,7 @@
   <w:p>
     <w:pPr>
       <w:pStyle w:val="LineNo"/>
-      <w:framePr w:w="1555" w:hSpace="0" w:wrap="around" w:vAnchor="page" w:hAnchor="page" w:x="0" w:y="1440"/>
+      <w:framePr w:w="1440" w:hSpace="0" w:wrap="around" w:vAnchor="page" w:hAnchor="page" w:x="0" w:y="1440"/>
     </w:pPr>
     <w:r>
       <w:rPr>
@@ -2089,7 +2089,7 @@
   <w:p>
     <w:pPr>
       <w:pStyle w:val="LineNo"/>
-      <w:framePr w:w="1555" w:hSpace="0" w:wrap="around" w:vAnchor="page" w:hAnchor="page" w:x="0" w:y="1440"/>
+      <w:framePr w:w="1440" w:hSpace="0" w:wrap="around" w:vAnchor="page" w:hAnchor="page" w:x="0" w:y="1440"/>
     </w:pPr>
     <w:r>
       <w:rPr>
@@ -2101,7 +2101,7 @@
   <w:p>
     <w:pPr>
       <w:pStyle w:val="LineNo"/>
-      <w:framePr w:w="1555" w:hSpace="0" w:wrap="around" w:vAnchor="page" w:hAnchor="page" w:x="0" w:y="1440"/>
+      <w:framePr w:w="1440" w:hSpace="0" w:wrap="around" w:vAnchor="page" w:hAnchor="page" w:x="0" w:y="1440"/>
     </w:pPr>
     <w:r>
       <w:rPr>
@@ -2113,7 +2113,7 @@
   <w:p>
     <w:pPr>
       <w:pStyle w:val="LineNo"/>
-      <w:framePr w:w="1555" w:hSpace="0" w:wrap="around" w:vAnchor="page" w:hAnchor="page" w:x="0" w:y="1440"/>
+      <w:framePr w:w="1440" w:hSpace="0" w:wrap="around" w:vAnchor="page" w:hAnchor="page" w:x="0" w:y="1440"/>
     </w:pPr>
     <w:r>
       <w:rPr>
@@ -2125,7 +2125,7 @@
   <w:p>
     <w:pPr>
       <w:pStyle w:val="LineNo"/>
-      <w:framePr w:w="1555" w:hSpace="0" w:wrap="around" w:vAnchor="page" w:hAnchor="page" w:x="0" w:y="1440"/>
+      <w:framePr w:w="1440" w:hSpace="0" w:wrap="around" w:vAnchor="page" w:hAnchor="page" w:x="0" w:y="1440"/>
     </w:pPr>
     <w:r>
       <w:rPr>
@@ -2137,7 +2137,7 @@
   <w:p>
     <w:pPr>
       <w:pStyle w:val="LineNo"/>
-      <w:framePr w:w="1555" w:hSpace="0" w:wrap="around" w:vAnchor="page" w:hAnchor="page" w:x="0" w:y="1440"/>
+      <w:framePr w:w="1440" w:hSpace="0" w:wrap="around" w:vAnchor="page" w:hAnchor="page" w:x="0" w:y="1440"/>
     </w:pPr>
     <w:r>
       <w:rPr>
@@ -2149,7 +2149,7 @@
   <w:p>
     <w:pPr>
       <w:pStyle w:val="LineNo"/>
-      <w:framePr w:w="1555" w:hSpace="0" w:wrap="around" w:vAnchor="page" w:hAnchor="page" w:x="0" w:y="1440"/>
+      <w:framePr w:w="1440" w:hSpace="0" w:wrap="around" w:vAnchor="page" w:hAnchor="page" w:x="0" w:y="1440"/>
     </w:pPr>
     <w:r>
       <w:rPr>
@@ -2161,7 +2161,7 @@
   <w:p>
     <w:pPr>
       <w:pStyle w:val="LineNo"/>
-      <w:framePr w:w="1555" w:hSpace="0" w:wrap="around" w:vAnchor="page" w:hAnchor="page" w:x="0" w:y="1440"/>
+      <w:framePr w:w="1440" w:hSpace="0" w:wrap="around" w:vAnchor="page" w:hAnchor="page" w:x="0" w:y="1440"/>
     </w:pPr>
     <w:r>
       <w:rPr>
@@ -2173,7 +2173,7 @@
   <w:p>
     <w:pPr>
       <w:pStyle w:val="LineNo"/>
-      <w:framePr w:w="1555" w:hSpace="0" w:wrap="around" w:vAnchor="page" w:hAnchor="page" w:x="0" w:y="1440"/>
+      <w:framePr w:w="1440" w:hSpace="0" w:wrap="around" w:vAnchor="page" w:hAnchor="page" w:x="0" w:y="1440"/>
     </w:pPr>
     <w:r>
       <w:rPr>
@@ -2185,7 +2185,7 @@
   <w:p>
     <w:pPr>
       <w:pStyle w:val="LineNo"/>
-      <w:framePr w:w="1555" w:hSpace="0" w:wrap="around" w:vAnchor="page" w:hAnchor="page" w:x="0" w:y="1440"/>
+      <w:framePr w:w="1440" w:hSpace="0" w:wrap="around" w:vAnchor="page" w:hAnchor="page" w:x="0" w:y="1440"/>
     </w:pPr>
     <w:r>
       <w:rPr>
@@ -2197,7 +2197,7 @@
   <w:p>
     <w:pPr>
       <w:pStyle w:val="LineNo"/>
-      <w:framePr w:w="1555" w:hSpace="0" w:wrap="around" w:vAnchor="page" w:hAnchor="page" w:x="0" w:y="1440"/>
+      <w:framePr w:w="1440" w:hSpace="0" w:wrap="around" w:vAnchor="page" w:hAnchor="page" w:x="0" w:y="1440"/>
     </w:pPr>
     <w:r>
       <w:rPr>
@@ -2209,7 +2209,7 @@
   <w:p>
     <w:pPr>
       <w:pStyle w:val="LineNo"/>
-      <w:framePr w:w="1555" w:hSpace="0" w:wrap="around" w:vAnchor="page" w:hAnchor="page" w:x="0" w:y="1440"/>
+      <w:framePr w:w="1440" w:hSpace="0" w:wrap="around" w:vAnchor="page" w:hAnchor="page" w:x="0" w:y="1440"/>
     </w:pPr>
     <w:r>
       <w:rPr>
@@ -2221,7 +2221,7 @@
   <w:p>
     <w:pPr>
       <w:pStyle w:val="LineNo"/>
-      <w:framePr w:w="1555" w:hSpace="0" w:wrap="around" w:vAnchor="page" w:hAnchor="page" w:x="0" w:y="1440"/>
+      <w:framePr w:w="1440" w:hSpace="0" w:wrap="around" w:vAnchor="page" w:hAnchor="page" w:x="0" w:y="1440"/>
     </w:pPr>
     <w:r>
       <w:rPr>
@@ -2327,7 +2327,7 @@
   <w:docDefaults>
     <w:rPrDefault>
       <w:rPr>
-        <w:rFonts w:ascii="EB Garamond" w:hAnsi="EB Garamond" w:eastAsia="EB Garamond" w:cs="EB Garamond"/>
+        <w:rFonts w:ascii="Times New Roman" w:hAnsi="Times New Roman" w:eastAsia="Times New Roman" w:cs="Times New Roman"/>
         <w:sz w:val="24"/>
         <w:szCs w:val="24"/>
         <w:lang w:val="en-US" w:eastAsia="zh-CN" w:bidi="ar-SA"/>
@@ -2349,7 +2349,7 @@
       <w:widowControl/>
     </w:pPr>
     <w:rPr>
-      <w:rFonts w:ascii="EB Garamond" w:hAnsi="EB Garamond" w:eastAsia="EB Garamond" w:cs="EB Garamond"/>
+      <w:rFonts w:ascii="Times New Roman" w:hAnsi="Times New Roman" w:eastAsia="Times New Roman" w:cs="Times New Roman"/>
       <w:sz w:val="24"/>
       <w:szCs w:val="24"/>
     </w:rPr>
@@ -2396,7 +2396,7 @@
       <w:jc w:val="center"/>
     </w:pPr>
     <w:rPr>
-      <w:rFonts w:ascii="EB Garamond" w:hAnsi="EB Garamond" w:eastAsia="EB Garamond" w:cs="EB Garamond"/>
+      <w:rFonts w:ascii="Times New Roman" w:hAnsi="Times New Roman" w:eastAsia="Times New Roman" w:cs="Times New Roman"/>
       <w:sz w:val="56"/>
       <w:szCs w:val="56"/>
     </w:rPr>
@@ -2408,7 +2408,7 @@
     <w:uiPriority w:val="10"/>
     <w:rsid w:val="00A10FD9"/>
     <w:rPr>
-      <w:rFonts w:ascii="EB Garamond" w:hAnsi="EB Garamond" w:eastAsia="EB Garamond" w:cs="EB Garamond"/>
+      <w:rFonts w:ascii="Times New Roman" w:hAnsi="Times New Roman" w:eastAsia="Times New Roman" w:cs="Times New Roman"/>
       <w:sz w:val="56"/>
       <w:szCs w:val="56"/>
     </w:rPr>
@@ -2427,7 +2427,7 @@
       </w:numPr>
     </w:pPr>
     <w:rPr>
-      <w:rFonts w:eastAsiaTheme="majorEastAsia" w:cstheme="majorBidi"/>
+      <w:rFonts w:cstheme="majorBidi"/>
       <w:spacing w:val="15"/>
       <w:sz w:val="28"/>
       <w:szCs w:val="28"/>
@@ -2440,7 +2440,7 @@
     <w:uiPriority w:val="11"/>
     <w:rsid w:val="00A10FD9"/>
     <w:rPr>
-      <w:rFonts w:eastAsiaTheme="majorEastAsia" w:cstheme="majorBidi"/>
+      <w:rFonts w:cstheme="majorBidi"/>
       <w:color w:val="595959" w:themeColor="text1" w:themeTint="A6"/>
       <w:spacing w:val="15"/>
       <w:sz w:val="28"/>
@@ -2599,7 +2599,7 @@
       <w:outlineLvl w:val="3"/>
     </w:pPr>
     <w:rPr>
-      <w:rFonts w:eastAsiaTheme="majorEastAsia" w:cstheme="majorBidi"/>
+      <w:rFonts w:cstheme="majorBidi"/>
       <w:i/>
       <w:iCs/>
       <w:color w:val="0F4761" w:themeColor="accent1" w:themeShade="BF"/>
@@ -2622,7 +2622,7 @@
       <w:outlineLvl w:val="4"/>
     </w:pPr>
     <w:rPr>
-      <w:rFonts w:eastAsiaTheme="majorEastAsia" w:cstheme="majorBidi"/>
+      <w:rFonts w:cstheme="majorBidi"/>
       <w:color w:val="0F4761" w:themeColor="accent1" w:themeShade="BF"/>
     </w:rPr>
   </w:style>
@@ -2643,7 +2643,7 @@
       <w:outlineLvl w:val="5"/>
     </w:pPr>
     <w:rPr>
-      <w:rFonts w:eastAsiaTheme="majorEastAsia" w:cstheme="majorBidi"/>
+      <w:rFonts w:cstheme="majorBidi"/>
       <w:i/>
       <w:iCs/>
       <w:color w:val="595959" w:themeColor="text1" w:themeTint="A6"/>
@@ -2666,7 +2666,7 @@
       <w:outlineLvl w:val="6"/>
     </w:pPr>
     <w:rPr>
-      <w:rFonts w:eastAsiaTheme="majorEastAsia" w:cstheme="majorBidi"/>
+      <w:rFonts w:cstheme="majorBidi"/>
       <w:color w:val="595959" w:themeColor="text1" w:themeTint="A6"/>
     </w:rPr>
   </w:style>
@@ -2687,7 +2687,7 @@
       <w:outlineLvl w:val="7"/>
     </w:pPr>
     <w:rPr>
-      <w:rFonts w:eastAsiaTheme="majorEastAsia" w:cstheme="majorBidi"/>
+      <w:rFonts w:cstheme="majorBidi"/>
       <w:i/>
       <w:iCs/>
       <w:color w:val="272727" w:themeColor="text1" w:themeTint="D8"/>
@@ -2710,7 +2710,7 @@
       <w:outlineLvl w:val="8"/>
     </w:pPr>
     <w:rPr>
-      <w:rFonts w:eastAsiaTheme="majorEastAsia" w:cstheme="majorBidi"/>
+      <w:rFonts w:cstheme="majorBidi"/>
       <w:color w:val="272727" w:themeColor="text1" w:themeTint="D8"/>
     </w:rPr>
   </w:style>
@@ -2721,7 +2721,7 @@
     <w:uiPriority w:val="9"/>
     <w:rsid w:val="00A10FD9"/>
     <w:rPr>
-      <w:rFonts w:ascii="EB Garamond" w:hAnsi="EB Garamond" w:eastAsia="EB Garamond" w:cs="EB Garamond"/>
+      <w:rFonts w:ascii="Times New Roman" w:hAnsi="Times New Roman" w:eastAsia="Times New Roman" w:cs="Times New Roman"/>
       <w:color w:val="0F4761" w:themeColor="accent1" w:themeShade="BF"/>
       <w:sz w:val="40"/>
       <w:szCs w:val="40"/>
@@ -2735,7 +2735,7 @@
     <w:semiHidden/>
     <w:rsid w:val="00A10FD9"/>
     <w:rPr>
-      <w:rFonts w:ascii="EB Garamond" w:hAnsi="EB Garamond" w:eastAsia="EB Garamond" w:cs="EB Garamond"/>
+      <w:rFonts w:ascii="Times New Roman" w:hAnsi="Times New Roman" w:eastAsia="Times New Roman" w:cs="Times New Roman"/>
       <w:color w:val="0F4761" w:themeColor="accent1" w:themeShade="BF"/>
       <w:sz w:val="32"/>
       <w:szCs w:val="32"/>
@@ -2749,7 +2749,7 @@
     <w:semiHidden/>
     <w:rsid w:val="00A10FD9"/>
     <w:rPr>
-      <w:rFonts w:eastAsiaTheme="majorEastAsia" w:cstheme="majorBidi"/>
+      <w:rFonts w:cstheme="majorBidi"/>
       <w:color w:val="0F4761" w:themeColor="accent1" w:themeShade="BF"/>
       <w:sz w:val="28"/>
       <w:szCs w:val="28"/>
@@ -2763,7 +2763,7 @@
     <w:semiHidden/>
     <w:rsid w:val="00A10FD9"/>
     <w:rPr>
-      <w:rFonts w:eastAsiaTheme="majorEastAsia" w:cstheme="majorBidi"/>
+      <w:rFonts w:cstheme="majorBidi"/>
       <w:i/>
       <w:iCs/>
       <w:color w:val="0F4761" w:themeColor="accent1" w:themeShade="BF"/>
@@ -2777,7 +2777,7 @@
     <w:semiHidden/>
     <w:rsid w:val="00A10FD9"/>
     <w:rPr>
-      <w:rFonts w:eastAsiaTheme="majorEastAsia" w:cstheme="majorBidi"/>
+      <w:rFonts w:cstheme="majorBidi"/>
       <w:color w:val="0F4761" w:themeColor="accent1" w:themeShade="BF"/>
     </w:rPr>
   </w:style>
@@ -2789,7 +2789,7 @@
     <w:semiHidden/>
     <w:rsid w:val="00A10FD9"/>
     <w:rPr>
-      <w:rFonts w:eastAsiaTheme="majorEastAsia" w:cstheme="majorBidi"/>
+      <w:rFonts w:cstheme="majorBidi"/>
       <w:i/>
       <w:iCs/>
       <w:color w:val="595959" w:themeColor="text1" w:themeTint="A6"/>
@@ -2803,7 +2803,7 @@
     <w:semiHidden/>
     <w:rsid w:val="00A10FD9"/>
     <w:rPr>
-      <w:rFonts w:eastAsiaTheme="majorEastAsia" w:cstheme="majorBidi"/>
+      <w:rFonts w:cstheme="majorBidi"/>
       <w:color w:val="595959" w:themeColor="text1" w:themeTint="A6"/>
     </w:rPr>
   </w:style>
@@ -2815,7 +2815,7 @@
     <w:semiHidden/>
     <w:rsid w:val="00A10FD9"/>
     <w:rPr>
-      <w:rFonts w:eastAsiaTheme="majorEastAsia" w:cstheme="majorBidi"/>
+      <w:rFonts w:cstheme="majorBidi"/>
       <w:i/>
       <w:iCs/>
       <w:color w:val="272727" w:themeColor="text1" w:themeTint="D8"/>
@@ -2829,7 +2829,7 @@
     <w:semiHidden/>
     <w:rsid w:val="00A10FD9"/>
     <w:rPr>
-      <w:rFonts w:eastAsiaTheme="majorEastAsia" w:cstheme="majorBidi"/>
+      <w:rFonts w:cstheme="majorBidi"/>
       <w:color w:val="272727" w:themeColor="text1" w:themeTint="D8"/>
     </w:rPr>
   </w:style>
@@ -2992,7 +2992,7 @@
       <w:outlineLvl w:val="9"/>
     </w:pPr>
     <w:rPr>
-      <w:rFonts w:ascii="EB Garamond" w:hAnsi="EB Garamond" w:eastAsia="EB Garamond" w:cs="EB Garamond"/>
+      <w:rFonts w:ascii="Times New Roman" w:hAnsi="Times New Roman" w:eastAsia="Times New Roman" w:cs="Times New Roman"/>
       <w:b w:val="0"/>
       <w:bCs w:val="0"/>
       <w:color w:val="365F91" w:themeColor="accent1" w:themeShade="BF"/>
@@ -3033,7 +3033,7 @@
     <w:unhideWhenUsed/>
     <w:pPr>
       <w:tabs>
-        <w:tab w:val="right" w:pos="9000"/>
+        <w:tab w:val="right" w:pos="8620"/>
       </w:tabs>
       <w:spacing w:before="0" w:after="0" w:line="240" w:lineRule="auto"/>
       <w:ind w:firstLine="0"/>
@@ -3143,7 +3143,7 @@
     <w:qFormat/>
     <w:pPr>
       <w:tabs>
-        <w:tab w:val="right" w:leader="dot" w:pos="9000"/>
+        <w:tab w:val="right" w:leader="dot" w:pos="8620"/>
       </w:tabs>
       <w:spacing w:before="0" w:after="240" w:line="276" w:lineRule="exact"/>
       <w:ind w:left="576" w:hanging="576" w:firstLine="0"/>
@@ -3185,7 +3185,7 @@
     <w:unhideWhenUsed/>
     <w:pPr>
       <w:tabs>
-        <w:tab w:val="right" w:leader="dot" w:pos="9000"/>
+        <w:tab w:val="right" w:leader="dot" w:pos="8620"/>
       </w:tabs>
       <w:spacing w:before="0" w:after="0" w:line="480" w:lineRule="exact"/>
       <w:ind w:left="720" w:hanging="720" w:firstLine="0"/>
@@ -3202,7 +3202,7 @@
     <w:unhideWhenUsed/>
     <w:pPr>
       <w:tabs>
-        <w:tab w:val="right" w:leader="dot" w:pos="9000"/>
+        <w:tab w:val="right" w:leader="dot" w:pos="8620"/>
       </w:tabs>
       <w:spacing w:before="0" w:after="0" w:line="480" w:lineRule="exact"/>
       <w:ind w:left="1440" w:hanging="720" w:firstLine="0"/>

</xml_diff>